<commit_message>
Add screenshots to week 1 learning document
Embed repo structure, PR #1, and commit history screenshots; fix commit count.

Co-Authored-By: Claude Sonnet 5 <noreply@anthropic.com>
</commit_message>
<xml_diff>
--- a/docs/第一週學習文件_單元0.docx
+++ b/docs/第一週學習文件_單元0.docx
@@ -1,6 +1,6 @@
 
 <file path=word/document.xml><?xml version="1.0" encoding="utf-8"?>
-<w:document xmlns:w="http://schemas.openxmlformats.org/wordprocessingml/2006/main">
+<w:document xmlns:w="http://schemas.openxmlformats.org/wordprocessingml/2006/main" xmlns:r="http://schemas.openxmlformats.org/officeDocument/2006/relationships" xmlns:wp="http://schemas.openxmlformats.org/drawingml/2006/wordprocessingDrawing">
   <w:body>
     <w:p>
       <w:pPr>
@@ -179,7 +179,7 @@
         <w:rPr>
           <w:rFonts w:ascii="Microsoft JhengHei" w:hAnsi="Microsoft JhengHei" w:eastAsia="Microsoft JhengHei"/>
         </w:rPr>
-        <w:t xml:space="preserve">git init、commit,並用 gh 推上 GitHub(共 4 個 commit,見下方 Agent 執行過程)</w:t>
+        <w:t xml:space="preserve">git init、commit,並用 gh 推上 GitHub(推送當下共 4 個 commit;截至目前 main 上共 6 筆,含學習文件與 PR 合併,見圖 3)</w:t>
       </w:r>
     </w:p>
     <w:p>
@@ -811,13 +811,164 @@
     </w:p>
     <w:p>
       <w:pPr>
-        <w:spacing w:after="120" w:line="320" w:lineRule="auto"/>
-      </w:pPr>
-      <w:r>
-        <w:rPr>
-          <w:rFonts w:ascii="Microsoft JhengHei" w:hAnsi="Microsoft JhengHei" w:eastAsia="Microsoft JhengHei"/>
-        </w:rPr>
-        <w:t xml:space="preserve">(待補:GitHub repo 頁面、README 渲染畫面、commit 紀錄。請將截圖放入 screenshots/ 並貼在此處。)</w:t>
+        <w:keepNext/>
+        <w:jc w:val="center"/>
+        <w:spacing w:before="120" w:after="60"/>
+      </w:pPr>
+      <w:r>
+        <w:drawing>
+          <wp:inline distT="0" distB="0" distL="0" distR="0">
+            <wp:extent cx="5400000" cy="2381348"/>
+            <wp:docPr id="1" name="Picture 1"/>
+            <a:graphic xmlns:a="http://schemas.openxmlformats.org/drawingml/2006/main">
+              <a:graphicData uri="http://schemas.openxmlformats.org/drawingml/2006/picture">
+                <pic:pic xmlns:pic="http://schemas.openxmlformats.org/drawingml/2006/picture">
+                  <pic:nvPicPr>
+                    <pic:cNvPr id="1" name="fig1.png"/>
+                    <pic:cNvPicPr/>
+                  </pic:nvPicPr>
+                  <pic:blipFill>
+                    <a:blip r:embed="rId10"/>
+                    <a:stretch>
+                      <a:fillRect/>
+                    </a:stretch>
+                  </pic:blipFill>
+                  <pic:spPr>
+                    <a:xfrm>
+                      <a:off x="0" y="0"/>
+                      <a:ext cx="5400000" cy="2381348"/>
+                    </a:xfrm>
+                    <a:prstGeom prst="rect">
+                      <a:avLst/>
+                    </a:prstGeom>
+                  </pic:spPr>
+                </pic:pic>
+              </a:graphicData>
+            </a:graphic>
+          </wp:inline>
+        </w:drawing>
+      </w:r>
+    </w:p>
+    <w:p>
+      <w:pPr>
+        <w:jc w:val="center"/>
+        <w:spacing w:after="200"/>
+      </w:pPr>
+      <w:r>
+        <w:rPr>
+          <w:rFonts w:ascii="Microsoft JhengHei" w:hAnsi="Microsoft JhengHei" w:eastAsia="Microsoft JhengHei"/>
+          <w:color w:val="555555"/>
+          <w:sz w:val="20"/>
+        </w:rPr>
+        <w:t xml:space="preserve">圖 1:GitHub repo 的資料夾結構(docs/、drafts/、screenshots/、.gitignore、README.md)</w:t>
+      </w:r>
+    </w:p>
+    <w:p>
+      <w:pPr>
+        <w:keepNext/>
+        <w:jc w:val="center"/>
+        <w:spacing w:before="120" w:after="60"/>
+      </w:pPr>
+      <w:r>
+        <w:drawing>
+          <wp:inline distT="0" distB="0" distL="0" distR="0">
+            <wp:extent cx="5400000" cy="2635494"/>
+            <wp:docPr id="2" name="Picture 2"/>
+            <a:graphic xmlns:a="http://schemas.openxmlformats.org/drawingml/2006/main">
+              <a:graphicData uri="http://schemas.openxmlformats.org/drawingml/2006/picture">
+                <pic:pic xmlns:pic="http://schemas.openxmlformats.org/drawingml/2006/picture">
+                  <pic:nvPicPr>
+                    <pic:cNvPr id="2" name="fig2.png"/>
+                    <pic:cNvPicPr/>
+                  </pic:nvPicPr>
+                  <pic:blipFill>
+                    <a:blip r:embed="rId11"/>
+                    <a:stretch>
+                      <a:fillRect/>
+                    </a:stretch>
+                  </pic:blipFill>
+                  <pic:spPr>
+                    <a:xfrm>
+                      <a:off x="0" y="0"/>
+                      <a:ext cx="5400000" cy="2635494"/>
+                    </a:xfrm>
+                    <a:prstGeom prst="rect">
+                      <a:avLst/>
+                    </a:prstGeom>
+                  </pic:spPr>
+                </pic:pic>
+              </a:graphicData>
+            </a:graphic>
+          </wp:inline>
+        </w:drawing>
+      </w:r>
+    </w:p>
+    <w:p>
+      <w:pPr>
+        <w:jc w:val="center"/>
+        <w:spacing w:after="200"/>
+      </w:pPr>
+      <w:r>
+        <w:rPr>
+          <w:rFonts w:ascii="Microsoft JhengHei" w:hAnsi="Microsoft JhengHei" w:eastAsia="Microsoft JhengHei"/>
+          <w:color w:val="555555"/>
+          <w:sz w:val="20"/>
+        </w:rPr>
+        <w:t xml:space="preserve">圖 2:Pull Request #1 已合併(Merged),合併後分支已刪除</w:t>
+      </w:r>
+    </w:p>
+    <w:p>
+      <w:pPr>
+        <w:keepNext/>
+        <w:jc w:val="center"/>
+        <w:spacing w:before="120" w:after="60"/>
+      </w:pPr>
+      <w:r>
+        <w:drawing>
+          <wp:inline distT="0" distB="0" distL="0" distR="0">
+            <wp:extent cx="5400000" cy="2361600"/>
+            <wp:docPr id="3" name="Picture 3"/>
+            <a:graphic xmlns:a="http://schemas.openxmlformats.org/drawingml/2006/main">
+              <a:graphicData uri="http://schemas.openxmlformats.org/drawingml/2006/picture">
+                <pic:pic xmlns:pic="http://schemas.openxmlformats.org/drawingml/2006/picture">
+                  <pic:nvPicPr>
+                    <pic:cNvPr id="3" name="fig3.png"/>
+                    <pic:cNvPicPr/>
+                  </pic:nvPicPr>
+                  <pic:blipFill>
+                    <a:blip r:embed="rId12"/>
+                    <a:stretch>
+                      <a:fillRect/>
+                    </a:stretch>
+                  </pic:blipFill>
+                  <pic:spPr>
+                    <a:xfrm>
+                      <a:off x="0" y="0"/>
+                      <a:ext cx="5400000" cy="2361600"/>
+                    </a:xfrm>
+                    <a:prstGeom prst="rect">
+                      <a:avLst/>
+                    </a:prstGeom>
+                  </pic:spPr>
+                </pic:pic>
+              </a:graphicData>
+            </a:graphic>
+          </wp:inline>
+        </w:drawing>
+      </w:r>
+    </w:p>
+    <w:p>
+      <w:pPr>
+        <w:jc w:val="center"/>
+        <w:spacing w:after="200"/>
+      </w:pPr>
+      <w:r>
+        <w:rPr>
+          <w:rFonts w:ascii="Microsoft JhengHei" w:hAnsi="Microsoft JhengHei" w:eastAsia="Microsoft JhengHei"/>
+          <w:color w:val="555555"/>
+          <w:sz w:val="20"/>
+        </w:rPr>
+        <w:t xml:space="preserve">圖 3:main 分支的 commit 紀錄(共 6 筆,含 PR 合併)</w:t>
       </w:r>
     </w:p>
     <w:sectPr>

</xml_diff>